<commit_message>
Part 4: add evidence fields, KAN-7 justification, fix Jira keys in conclusion
</commit_message>
<xml_diff>
--- a/SUBMISSION_REPORT.docx
+++ b/SUBMISSION_REPORT.docx
@@ -121,7 +121,7 @@
         <w:rPr>
           <w:sz w:val="20"/>
         </w:rPr>
-        <w:t xml:space="preserve"> KAN — https://alihaiderbajwa123.atlassian.net/jira/software/projects/KAN/</w:t>
+        <w:t xml:space="preserve"> KAN — https://abdulwadood3055.atlassian.net/jira/software/projects/KAN/</w:t>
       </w:r>
     </w:p>
     <w:p>
@@ -973,7 +973,7 @@
                 <w:rFonts w:ascii="Consolas" w:hAnsi="Consolas"/>
                 <w:sz w:val="18"/>
               </w:rPr>
-              <w:t>**PLACEHOLDER**</w:t>
+              <w:t>Complete</w:t>
             </w:r>
           </w:p>
         </w:tc>
@@ -987,7 +987,7 @@
                 <w:rFonts w:ascii="Consolas" w:hAnsi="Consolas"/>
                 <w:sz w:val="18"/>
               </w:rPr>
-              <w:t>Part 4 — to be logged before submission</w:t>
+              <w:t>Part 4 — KAN-4, KAN-5, KAN-6, KAN-7 logged with attachments</w:t>
             </w:r>
           </w:p>
         </w:tc>
@@ -9236,7 +9236,7 @@
                 <w:rFonts w:ascii="Consolas" w:hAnsi="Consolas"/>
                 <w:sz w:val="18"/>
               </w:rPr>
-              <w:t>BUG-003: Error message not rendered for failed open database operation</w:t>
+              <w:t>KAN-6: Error message not rendered for failed open database operation</w:t>
             </w:r>
           </w:p>
         </w:tc>
@@ -10370,7 +10370,7 @@
                 <w:rFonts w:ascii="Consolas" w:hAnsi="Consolas"/>
                 <w:sz w:val="18"/>
               </w:rPr>
-              <w:t>BUG-004 observed but does not affect core entry creation</w:t>
+              <w:t>KAN-7 observed but does not affect core entry creation</w:t>
             </w:r>
           </w:p>
         </w:tc>
@@ -11076,7 +11076,7 @@
                 <w:rFonts w:ascii="Consolas" w:hAnsi="Consolas"/>
                 <w:sz w:val="18"/>
               </w:rPr>
-              <w:t>Entry updated successfully; BUG-004 ("Invalid Date") still visible in detail view</w:t>
+              <w:t>Entry updated successfully; KAN-7 ("Invalid Date") still visible in detail view</w:t>
             </w:r>
           </w:p>
         </w:tc>
@@ -11136,7 +11136,7 @@
                 <w:rFonts w:ascii="Consolas" w:hAnsi="Consolas"/>
                 <w:sz w:val="18"/>
               </w:rPr>
-              <w:t>`test-screenshots/TC10-dates-fixed.png` — updated username visible; BUG-004 date issue shown</w:t>
+              <w:t>`test-screenshots/TC10-edit-entry.png` — updated username visible; BUG-004 date issue shown</w:t>
             </w:r>
           </w:p>
         </w:tc>
@@ -11504,7 +11504,7 @@
                 <w:rFonts w:ascii="Consolas" w:hAnsi="Consolas"/>
                 <w:sz w:val="18"/>
               </w:rPr>
-              <w:t>`test-screenshots/TC11-main-view.png` — entry list after deletion</w:t>
+              <w:t>`test-screenshots/TC11-delete-entry.png` — entry list after deletion</w:t>
             </w:r>
           </w:p>
         </w:tc>
@@ -12976,7 +12976,7 @@
                 <w:rFonts w:ascii="Consolas" w:hAnsi="Consolas"/>
                 <w:sz w:val="18"/>
               </w:rPr>
-              <w:t>`test-screenshots/TC15-keyfile-blocked.png` — key file path input shown; BUG-001 blocks execution</w:t>
+              <w:t>`test-screenshots/TC15-keyfile-blocked.png` — key file path input shown; KAN-4 blocks execution</w:t>
             </w:r>
           </w:p>
         </w:tc>
@@ -13344,7 +13344,7 @@
                 <w:rFonts w:ascii="Consolas" w:hAnsi="Consolas"/>
                 <w:sz w:val="18"/>
               </w:rPr>
-              <w:t>`test-screenshots/TC16-autotype-failed.png` — entry with Auto-Type notes; no execution UI; BUG-002</w:t>
+              <w:t>`test-screenshots/TC16-autotype-failed.png` — entry with Auto-Type notes; no execution UI; KAN-5</w:t>
             </w:r>
           </w:p>
         </w:tc>
@@ -13823,7 +13823,7 @@
                 <w:rFonts w:ascii="Consolas" w:hAnsi="Consolas"/>
                 <w:sz w:val="18"/>
               </w:rPr>
-              <w:t>BUG-003</w:t>
+              <w:t>KAN-6</w:t>
             </w:r>
           </w:p>
         </w:tc>
@@ -14543,7 +14543,7 @@
                 <w:rFonts w:ascii="Consolas" w:hAnsi="Consolas"/>
                 <w:sz w:val="18"/>
               </w:rPr>
-              <w:t>BUG-001</w:t>
+              <w:t>KAN-4</w:t>
             </w:r>
           </w:p>
         </w:tc>
@@ -14615,7 +14615,7 @@
                 <w:rFonts w:ascii="Consolas" w:hAnsi="Consolas"/>
                 <w:sz w:val="18"/>
               </w:rPr>
-              <w:t>BUG-002</w:t>
+              <w:t>KAN-5</w:t>
             </w:r>
           </w:p>
         </w:tc>
@@ -14732,7 +14732,7 @@
                 <w:rFonts w:ascii="Consolas" w:hAnsi="Consolas"/>
                 <w:sz w:val="18"/>
               </w:rPr>
-              <w:t>`KAN-001` *(to be created)*</w:t>
+              <w:t>`KAN-4`</w:t>
             </w:r>
           </w:p>
         </w:tc>
@@ -14762,7 +14762,7 @@
                 <w:rFonts w:ascii="Consolas" w:hAnsi="Consolas"/>
                 <w:sz w:val="18"/>
               </w:rPr>
-              <w:t>`https://alihaiderbajwa123.atlassian.net/browse/KAN-001` *(after creation)*</w:t>
+              <w:t>`https://abdulwadood3055.atlassian.net/browse/KAN-4`</w:t>
             </w:r>
           </w:p>
         </w:tc>
@@ -15063,6 +15063,36 @@
                 <w:sz w:val="18"/>
               </w:rPr>
               <w:t>TC-15</w:t>
+            </w:r>
+          </w:p>
+        </w:tc>
+      </w:tr>
+      <w:tr>
+        <w:tc>
+          <w:tcPr>
+            <w:tcW w:type="dxa" w:w="4703"/>
+          </w:tcPr>
+          <w:p>
+            <w:r>
+              <w:rPr>
+                <w:rFonts w:ascii="Consolas" w:hAnsi="Consolas"/>
+                <w:sz w:val="18"/>
+              </w:rPr>
+              <w:t>**Supporting Evidence**</w:t>
+            </w:r>
+          </w:p>
+        </w:tc>
+        <w:tc>
+          <w:tcPr>
+            <w:tcW w:type="dxa" w:w="4703"/>
+          </w:tcPr>
+          <w:p>
+            <w:r>
+              <w:rPr>
+                <w:rFonts w:ascii="Consolas" w:hAnsi="Consolas"/>
+                <w:sz w:val="18"/>
+              </w:rPr>
+              <w:t>`test-screenshots/TC15-keyfile-blocked.png`; Jira attachment `KeyFile_u....png`</w:t>
             </w:r>
           </w:p>
         </w:tc>
@@ -15182,7 +15212,7 @@
                 <w:rFonts w:ascii="Consolas" w:hAnsi="Consolas"/>
                 <w:sz w:val="18"/>
               </w:rPr>
-              <w:t>`KAN-002` *(to be created)*</w:t>
+              <w:t>`KAN-5`</w:t>
             </w:r>
           </w:p>
         </w:tc>
@@ -15212,7 +15242,7 @@
                 <w:rFonts w:ascii="Consolas" w:hAnsi="Consolas"/>
                 <w:sz w:val="18"/>
               </w:rPr>
-              <w:t>`https://alihaiderbajwa123.atlassian.net/browse/KAN-002` *(after creation)*</w:t>
+              <w:t>`https://abdulwadood3055.atlassian.net/browse/KAN-5`</w:t>
             </w:r>
           </w:p>
         </w:tc>
@@ -15513,6 +15543,36 @@
                 <w:sz w:val="18"/>
               </w:rPr>
               <w:t>TC-16</w:t>
+            </w:r>
+          </w:p>
+        </w:tc>
+      </w:tr>
+      <w:tr>
+        <w:tc>
+          <w:tcPr>
+            <w:tcW w:type="dxa" w:w="4703"/>
+          </w:tcPr>
+          <w:p>
+            <w:r>
+              <w:rPr>
+                <w:rFonts w:ascii="Consolas" w:hAnsi="Consolas"/>
+                <w:sz w:val="18"/>
+              </w:rPr>
+              <w:t>**Supporting Evidence**</w:t>
+            </w:r>
+          </w:p>
+        </w:tc>
+        <w:tc>
+          <w:tcPr>
+            <w:tcW w:type="dxa" w:w="4703"/>
+          </w:tcPr>
+          <w:p>
+            <w:r>
+              <w:rPr>
+                <w:rFonts w:ascii="Consolas" w:hAnsi="Consolas"/>
+                <w:sz w:val="18"/>
+              </w:rPr>
+              <w:t>`test-screenshots/TC16-autotype-failed.png`; Jira attachment `AutoType.png`</w:t>
             </w:r>
           </w:p>
         </w:tc>
@@ -15632,7 +15692,7 @@
                 <w:rFonts w:ascii="Consolas" w:hAnsi="Consolas"/>
                 <w:sz w:val="18"/>
               </w:rPr>
-              <w:t>`KAN-003` *(to be created)*</w:t>
+              <w:t>`KAN-6`</w:t>
             </w:r>
           </w:p>
         </w:tc>
@@ -15662,7 +15722,7 @@
                 <w:rFonts w:ascii="Consolas" w:hAnsi="Consolas"/>
                 <w:sz w:val="18"/>
               </w:rPr>
-              <w:t>`https://alihaiderbajwa123.atlassian.net/browse/KAN-003` *(after creation)*</w:t>
+              <w:t>`https://abdulwadood3055.atlassian.net/browse/KAN-6`</w:t>
             </w:r>
           </w:p>
         </w:tc>
@@ -15963,6 +16023,36 @@
                 <w:sz w:val="18"/>
               </w:rPr>
               <w:t>TC-05</w:t>
+            </w:r>
+          </w:p>
+        </w:tc>
+      </w:tr>
+      <w:tr>
+        <w:tc>
+          <w:tcPr>
+            <w:tcW w:type="dxa" w:w="4703"/>
+          </w:tcPr>
+          <w:p>
+            <w:r>
+              <w:rPr>
+                <w:rFonts w:ascii="Consolas" w:hAnsi="Consolas"/>
+                <w:sz w:val="18"/>
+              </w:rPr>
+              <w:t>**Supporting Evidence**</w:t>
+            </w:r>
+          </w:p>
+        </w:tc>
+        <w:tc>
+          <w:tcPr>
+            <w:tcW w:type="dxa" w:w="4703"/>
+          </w:tcPr>
+          <w:p>
+            <w:r>
+              <w:rPr>
+                <w:rFonts w:ascii="Consolas" w:hAnsi="Consolas"/>
+                <w:sz w:val="18"/>
+              </w:rPr>
+              <w:t>`test-screenshots/TC05-wrong-password.png`; Jira attachment `Wrong_....png`; console shows 401 response</w:t>
             </w:r>
           </w:p>
         </w:tc>
@@ -16082,7 +16172,7 @@
                 <w:rFonts w:ascii="Consolas" w:hAnsi="Consolas"/>
                 <w:sz w:val="18"/>
               </w:rPr>
-              <w:t>`KAN-004` *(to be created)*</w:t>
+              <w:t>`KAN-7`</w:t>
             </w:r>
           </w:p>
         </w:tc>
@@ -16112,7 +16202,7 @@
                 <w:rFonts w:ascii="Consolas" w:hAnsi="Consolas"/>
                 <w:sz w:val="18"/>
               </w:rPr>
-              <w:t>`https://alihaiderbajwa123.atlassian.net/browse/KAN-004` *(after creation)*</w:t>
+              <w:t>`https://abdulwadood3055.atlassian.net/browse/KAN-7`</w:t>
             </w:r>
           </w:p>
         </w:tc>
@@ -16413,6 +16503,66 @@
                 <w:sz w:val="18"/>
               </w:rPr>
               <w:t>TC-08, TC-10</w:t>
+            </w:r>
+          </w:p>
+        </w:tc>
+      </w:tr>
+      <w:tr>
+        <w:tc>
+          <w:tcPr>
+            <w:tcW w:type="dxa" w:w="4703"/>
+          </w:tcPr>
+          <w:p>
+            <w:r>
+              <w:rPr>
+                <w:rFonts w:ascii="Consolas" w:hAnsi="Consolas"/>
+                <w:sz w:val="18"/>
+              </w:rPr>
+              <w:t>**Supporting Evidence**</w:t>
+            </w:r>
+          </w:p>
+        </w:tc>
+        <w:tc>
+          <w:tcPr>
+            <w:tcW w:type="dxa" w:w="4703"/>
+          </w:tcPr>
+          <w:p>
+            <w:r>
+              <w:rPr>
+                <w:rFonts w:ascii="Consolas" w:hAnsi="Consolas"/>
+                <w:sz w:val="18"/>
+              </w:rPr>
+              <w:t>`test-screenshots/TC08-create-entry.png` (shows "Invalid Date" in detail view); Jira attachment `Invalid_D....png`</w:t>
+            </w:r>
+          </w:p>
+        </w:tc>
+      </w:tr>
+      <w:tr>
+        <w:tc>
+          <w:tcPr>
+            <w:tcW w:type="dxa" w:w="4703"/>
+          </w:tcPr>
+          <w:p>
+            <w:r>
+              <w:rPr>
+                <w:rFonts w:ascii="Consolas" w:hAnsi="Consolas"/>
+                <w:sz w:val="18"/>
+              </w:rPr>
+              <w:t>**Justification for Logging**</w:t>
+            </w:r>
+          </w:p>
+        </w:tc>
+        <w:tc>
+          <w:tcPr>
+            <w:tcW w:type="dxa" w:w="4703"/>
+          </w:tcPr>
+          <w:p>
+            <w:r>
+              <w:rPr>
+                <w:rFonts w:ascii="Consolas" w:hAnsi="Consolas"/>
+                <w:sz w:val="18"/>
+              </w:rPr>
+              <w:t>Although TC-08 and TC-10 passed their primary objectives (entry creation/editing), this defect represents a genuine UI display error that affects user experience. It was consistently reproducible and qualifies as a confirmed implementation defect per the defect investigation criteria.</w:t>
             </w:r>
           </w:p>
         </w:tc>
@@ -16460,6 +16610,457 @@
         <w:t>Jira Evidence / Export</w:t>
       </w:r>
     </w:p>
+    <w:p>
+      <w:r>
+        <w:rPr>
+          <w:sz w:val="20"/>
+        </w:rPr>
+      </w:r>
+      <w:r>
+        <w:rPr>
+          <w:b/>
+          <w:sz w:val="20"/>
+        </w:rPr>
+        <w:t>Jira Project:</w:t>
+      </w:r>
+      <w:r>
+        <w:rPr>
+          <w:sz w:val="20"/>
+        </w:rPr>
+        <w:t xml:space="preserve"> KAN</w:t>
+      </w:r>
+    </w:p>
+    <w:p>
+      <w:r>
+        <w:rPr>
+          <w:sz w:val="20"/>
+        </w:rPr>
+      </w:r>
+      <w:r>
+        <w:rPr>
+          <w:b/>
+          <w:sz w:val="20"/>
+        </w:rPr>
+        <w:t>Jira URL:</w:t>
+      </w:r>
+      <w:r>
+        <w:rPr>
+          <w:sz w:val="20"/>
+        </w:rPr>
+        <w:t xml:space="preserve"> https://abdulwadood3055.atlassian.net/jira/software/projects/KAN/</w:t>
+      </w:r>
+    </w:p>
+    <w:p>
+      <w:r>
+        <w:rPr>
+          <w:sz w:val="20"/>
+        </w:rPr>
+      </w:r>
+      <w:r>
+        <w:rPr>
+          <w:b/>
+          <w:sz w:val="20"/>
+        </w:rPr>
+        <w:t>Board:</w:t>
+      </w:r>
+      <w:r>
+        <w:rPr>
+          <w:sz w:val="20"/>
+        </w:rPr>
+        <w:t xml:space="preserve"> Kanban board with 4 bugs in "To Do" status</w:t>
+      </w:r>
+    </w:p>
+    <w:tbl>
+      <w:tblPr>
+        <w:tblStyle w:val="TableGrid"/>
+        <w:tblW w:type="auto" w:w="0"/>
+        <w:jc w:val="left"/>
+        <w:tblLook w:firstColumn="1" w:firstRow="1" w:lastColumn="0" w:lastRow="0" w:noHBand="0" w:noVBand="1" w:val="04A0"/>
+      </w:tblPr>
+      <w:tblGrid>
+        <w:gridCol w:w="1881"/>
+        <w:gridCol w:w="1881"/>
+        <w:gridCol w:w="1881"/>
+        <w:gridCol w:w="1881"/>
+        <w:gridCol w:w="1881"/>
+      </w:tblGrid>
+      <w:tr>
+        <w:tc>
+          <w:tcPr>
+            <w:tcW w:type="dxa" w:w="1881"/>
+            <w:shd w:fill="1a1a2e" w:val="clear"/>
+          </w:tcPr>
+          <w:p>
+            <w:r>
+              <w:rPr>
+                <w:rFonts w:ascii="Consolas" w:hAnsi="Consolas"/>
+                <w:b/>
+                <w:color w:val="FFFFFF"/>
+                <w:sz w:val="18"/>
+              </w:rPr>
+              <w:t>Jira Key</w:t>
+            </w:r>
+          </w:p>
+        </w:tc>
+        <w:tc>
+          <w:tcPr>
+            <w:tcW w:type="dxa" w:w="1881"/>
+            <w:shd w:fill="1a1a2e" w:val="clear"/>
+          </w:tcPr>
+          <w:p>
+            <w:r>
+              <w:rPr>
+                <w:rFonts w:ascii="Consolas" w:hAnsi="Consolas"/>
+                <w:b/>
+                <w:color w:val="FFFFFF"/>
+                <w:sz w:val="18"/>
+              </w:rPr>
+              <w:t>Title</w:t>
+            </w:r>
+          </w:p>
+        </w:tc>
+        <w:tc>
+          <w:tcPr>
+            <w:tcW w:type="dxa" w:w="1881"/>
+            <w:shd w:fill="1a1a2e" w:val="clear"/>
+          </w:tcPr>
+          <w:p>
+            <w:r>
+              <w:rPr>
+                <w:rFonts w:ascii="Consolas" w:hAnsi="Consolas"/>
+                <w:b/>
+                <w:color w:val="FFFFFF"/>
+                <w:sz w:val="18"/>
+              </w:rPr>
+              <w:t>Severity</w:t>
+            </w:r>
+          </w:p>
+        </w:tc>
+        <w:tc>
+          <w:tcPr>
+            <w:tcW w:type="dxa" w:w="1881"/>
+            <w:shd w:fill="1a1a2e" w:val="clear"/>
+          </w:tcPr>
+          <w:p>
+            <w:r>
+              <w:rPr>
+                <w:rFonts w:ascii="Consolas" w:hAnsi="Consolas"/>
+                <w:b/>
+                <w:color w:val="FFFFFF"/>
+                <w:sz w:val="18"/>
+              </w:rPr>
+              <w:t>Status</w:t>
+            </w:r>
+          </w:p>
+        </w:tc>
+        <w:tc>
+          <w:tcPr>
+            <w:tcW w:type="dxa" w:w="1881"/>
+            <w:shd w:fill="1a1a2e" w:val="clear"/>
+          </w:tcPr>
+          <w:p>
+            <w:r>
+              <w:rPr>
+                <w:rFonts w:ascii="Consolas" w:hAnsi="Consolas"/>
+                <w:b/>
+                <w:color w:val="FFFFFF"/>
+                <w:sz w:val="18"/>
+              </w:rPr>
+              <w:t>Related TC</w:t>
+            </w:r>
+          </w:p>
+        </w:tc>
+      </w:tr>
+      <w:tr>
+        <w:tc>
+          <w:tcPr>
+            <w:tcW w:type="dxa" w:w="1881"/>
+          </w:tcPr>
+          <w:p>
+            <w:r>
+              <w:rPr>
+                <w:rFonts w:ascii="Consolas" w:hAnsi="Consolas"/>
+                <w:sz w:val="18"/>
+              </w:rPr>
+              <w:t>KAN-4</w:t>
+            </w:r>
+          </w:p>
+        </w:tc>
+        <w:tc>
+          <w:tcPr>
+            <w:tcW w:type="dxa" w:w="1881"/>
+          </w:tcPr>
+          <w:p>
+            <w:r>
+              <w:rPr>
+                <w:rFonts w:ascii="Consolas" w:hAnsi="Consolas"/>
+                <w:sz w:val="18"/>
+              </w:rPr>
+              <w:t>Key file upload not supported in web interface</w:t>
+            </w:r>
+          </w:p>
+        </w:tc>
+        <w:tc>
+          <w:tcPr>
+            <w:tcW w:type="dxa" w:w="1881"/>
+          </w:tcPr>
+          <w:p>
+            <w:r>
+              <w:rPr>
+                <w:rFonts w:ascii="Consolas" w:hAnsi="Consolas"/>
+                <w:sz w:val="18"/>
+              </w:rPr>
+              <w:t>Major</w:t>
+            </w:r>
+          </w:p>
+        </w:tc>
+        <w:tc>
+          <w:tcPr>
+            <w:tcW w:type="dxa" w:w="1881"/>
+          </w:tcPr>
+          <w:p>
+            <w:r>
+              <w:rPr>
+                <w:rFonts w:ascii="Consolas" w:hAnsi="Consolas"/>
+                <w:sz w:val="18"/>
+              </w:rPr>
+              <w:t>To Do</w:t>
+            </w:r>
+          </w:p>
+        </w:tc>
+        <w:tc>
+          <w:tcPr>
+            <w:tcW w:type="dxa" w:w="1881"/>
+          </w:tcPr>
+          <w:p>
+            <w:r>
+              <w:rPr>
+                <w:rFonts w:ascii="Consolas" w:hAnsi="Consolas"/>
+                <w:sz w:val="18"/>
+              </w:rPr>
+              <w:t>TC-15</w:t>
+            </w:r>
+          </w:p>
+        </w:tc>
+      </w:tr>
+      <w:tr>
+        <w:tc>
+          <w:tcPr>
+            <w:tcW w:type="dxa" w:w="1881"/>
+          </w:tcPr>
+          <w:p>
+            <w:r>
+              <w:rPr>
+                <w:rFonts w:ascii="Consolas" w:hAnsi="Consolas"/>
+                <w:sz w:val="18"/>
+              </w:rPr>
+              <w:t>KAN-5</w:t>
+            </w:r>
+          </w:p>
+        </w:tc>
+        <w:tc>
+          <w:tcPr>
+            <w:tcW w:type="dxa" w:w="1881"/>
+          </w:tcPr>
+          <w:p>
+            <w:r>
+              <w:rPr>
+                <w:rFonts w:ascii="Consolas" w:hAnsi="Consolas"/>
+                <w:sz w:val="18"/>
+              </w:rPr>
+              <w:t>Auto-Type sequence parsed but not executable from UI</w:t>
+            </w:r>
+          </w:p>
+        </w:tc>
+        <w:tc>
+          <w:tcPr>
+            <w:tcW w:type="dxa" w:w="1881"/>
+          </w:tcPr>
+          <w:p>
+            <w:r>
+              <w:rPr>
+                <w:rFonts w:ascii="Consolas" w:hAnsi="Consolas"/>
+                <w:sz w:val="18"/>
+              </w:rPr>
+              <w:t>Minor</w:t>
+            </w:r>
+          </w:p>
+        </w:tc>
+        <w:tc>
+          <w:tcPr>
+            <w:tcW w:type="dxa" w:w="1881"/>
+          </w:tcPr>
+          <w:p>
+            <w:r>
+              <w:rPr>
+                <w:rFonts w:ascii="Consolas" w:hAnsi="Consolas"/>
+                <w:sz w:val="18"/>
+              </w:rPr>
+              <w:t>To Do</w:t>
+            </w:r>
+          </w:p>
+        </w:tc>
+        <w:tc>
+          <w:tcPr>
+            <w:tcW w:type="dxa" w:w="1881"/>
+          </w:tcPr>
+          <w:p>
+            <w:r>
+              <w:rPr>
+                <w:rFonts w:ascii="Consolas" w:hAnsi="Consolas"/>
+                <w:sz w:val="18"/>
+              </w:rPr>
+              <w:t>TC-16</w:t>
+            </w:r>
+          </w:p>
+        </w:tc>
+      </w:tr>
+      <w:tr>
+        <w:tc>
+          <w:tcPr>
+            <w:tcW w:type="dxa" w:w="1881"/>
+          </w:tcPr>
+          <w:p>
+            <w:r>
+              <w:rPr>
+                <w:rFonts w:ascii="Consolas" w:hAnsi="Consolas"/>
+                <w:sz w:val="18"/>
+              </w:rPr>
+              <w:t>KAN-6</w:t>
+            </w:r>
+          </w:p>
+        </w:tc>
+        <w:tc>
+          <w:tcPr>
+            <w:tcW w:type="dxa" w:w="1881"/>
+          </w:tcPr>
+          <w:p>
+            <w:r>
+              <w:rPr>
+                <w:rFonts w:ascii="Consolas" w:hAnsi="Consolas"/>
+                <w:sz w:val="18"/>
+              </w:rPr>
+              <w:t>Incorrect password error not shown in UI form</w:t>
+            </w:r>
+          </w:p>
+        </w:tc>
+        <w:tc>
+          <w:tcPr>
+            <w:tcW w:type="dxa" w:w="1881"/>
+          </w:tcPr>
+          <w:p>
+            <w:r>
+              <w:rPr>
+                <w:rFonts w:ascii="Consolas" w:hAnsi="Consolas"/>
+                <w:sz w:val="18"/>
+              </w:rPr>
+              <w:t>Major</w:t>
+            </w:r>
+          </w:p>
+        </w:tc>
+        <w:tc>
+          <w:tcPr>
+            <w:tcW w:type="dxa" w:w="1881"/>
+          </w:tcPr>
+          <w:p>
+            <w:r>
+              <w:rPr>
+                <w:rFonts w:ascii="Consolas" w:hAnsi="Consolas"/>
+                <w:sz w:val="18"/>
+              </w:rPr>
+              <w:t>To Do</w:t>
+            </w:r>
+          </w:p>
+        </w:tc>
+        <w:tc>
+          <w:tcPr>
+            <w:tcW w:type="dxa" w:w="1881"/>
+          </w:tcPr>
+          <w:p>
+            <w:r>
+              <w:rPr>
+                <w:rFonts w:ascii="Consolas" w:hAnsi="Consolas"/>
+                <w:sz w:val="18"/>
+              </w:rPr>
+              <w:t>TC-05</w:t>
+            </w:r>
+          </w:p>
+        </w:tc>
+      </w:tr>
+      <w:tr>
+        <w:tc>
+          <w:tcPr>
+            <w:tcW w:type="dxa" w:w="1881"/>
+          </w:tcPr>
+          <w:p>
+            <w:r>
+              <w:rPr>
+                <w:rFonts w:ascii="Consolas" w:hAnsi="Consolas"/>
+                <w:sz w:val="18"/>
+              </w:rPr>
+              <w:t>KAN-7</w:t>
+            </w:r>
+          </w:p>
+        </w:tc>
+        <w:tc>
+          <w:tcPr>
+            <w:tcW w:type="dxa" w:w="1881"/>
+          </w:tcPr>
+          <w:p>
+            <w:r>
+              <w:rPr>
+                <w:rFonts w:ascii="Consolas" w:hAnsi="Consolas"/>
+                <w:sz w:val="18"/>
+              </w:rPr>
+              <w:t>Created/Updated timestamps show "Invalid Date"</w:t>
+            </w:r>
+          </w:p>
+        </w:tc>
+        <w:tc>
+          <w:tcPr>
+            <w:tcW w:type="dxa" w:w="1881"/>
+          </w:tcPr>
+          <w:p>
+            <w:r>
+              <w:rPr>
+                <w:rFonts w:ascii="Consolas" w:hAnsi="Consolas"/>
+                <w:sz w:val="18"/>
+              </w:rPr>
+              <w:t>Minor</w:t>
+            </w:r>
+          </w:p>
+        </w:tc>
+        <w:tc>
+          <w:tcPr>
+            <w:tcW w:type="dxa" w:w="1881"/>
+          </w:tcPr>
+          <w:p>
+            <w:r>
+              <w:rPr>
+                <w:rFonts w:ascii="Consolas" w:hAnsi="Consolas"/>
+                <w:sz w:val="18"/>
+              </w:rPr>
+              <w:t>To Do</w:t>
+            </w:r>
+          </w:p>
+        </w:tc>
+        <w:tc>
+          <w:tcPr>
+            <w:tcW w:type="dxa" w:w="1881"/>
+          </w:tcPr>
+          <w:p>
+            <w:r>
+              <w:rPr>
+                <w:rFonts w:ascii="Consolas" w:hAnsi="Consolas"/>
+                <w:sz w:val="18"/>
+              </w:rPr>
+              <w:t>TC-08, TC-10</w:t>
+            </w:r>
+          </w:p>
+        </w:tc>
+      </w:tr>
+    </w:tbl>
+    <w:p/>
     <w:p>
       <w:pPr>
         <w:ind w:left="567"/>
@@ -16478,7 +17079,7 @@
           <w:color w:val="969696"/>
           <w:sz w:val="20"/>
         </w:rPr>
-        <w:t>TODO BEFORE SUBMISSION:</w:t>
+        <w:t>Attachments on each Jira issue:</w:t>
       </w:r>
       <w:r>
         <w:rPr>
@@ -16486,234 +17087,7 @@
           <w:color w:val="969696"/>
           <w:sz w:val="20"/>
         </w:rPr>
-        <w:t xml:space="preserve"> Export the following from Jira and include as an attachment or appendix:</w:t>
-      </w:r>
-    </w:p>
-    <w:p>
-      <w:pPr>
-        <w:ind w:left="567"/>
-      </w:pPr>
-      <w:r>
-        <w:rPr>
-          <w:i/>
-          <w:color w:val="969696"/>
-          <w:sz w:val="20"/>
-        </w:rPr>
-        <w:t>1. Jira board screenshot showing KAN-001 through KAN-004</w:t>
-      </w:r>
-    </w:p>
-    <w:p>
-      <w:pPr>
-        <w:ind w:left="567"/>
-      </w:pPr>
-      <w:r>
-        <w:rPr>
-          <w:i/>
-          <w:color w:val="969696"/>
-          <w:sz w:val="20"/>
-        </w:rPr>
-        <w:t>2. Individual issue exports (PDF or screenshot) for each defect</w:t>
-      </w:r>
-    </w:p>
-    <w:p>
-      <w:pPr>
-        <w:ind w:left="567"/>
-      </w:pPr>
-      <w:r>
-        <w:rPr>
-          <w:i/>
-          <w:color w:val="969696"/>
-          <w:sz w:val="20"/>
-        </w:rPr>
-        <w:t>3. Filtered view of all bugs in project KAN</w:t>
-      </w:r>
-    </w:p>
-    <w:p>
-      <w:pPr>
-        <w:ind w:left="567"/>
-      </w:pPr>
-      <w:r>
-        <w:rPr>
-          <w:i/>
-          <w:color w:val="969696"/>
-          <w:sz w:val="20"/>
-        </w:rPr>
-      </w:r>
-    </w:p>
-    <w:p>
-      <w:pPr>
-        <w:ind w:left="567"/>
-      </w:pPr>
-      <w:r>
-        <w:rPr>
-          <w:i/>
-          <w:color w:val="969696"/>
-          <w:sz w:val="20"/>
-        </w:rPr>
-      </w:r>
-      <w:r>
-        <w:rPr>
-          <w:b/>
-          <w:i/>
-          <w:color w:val="969696"/>
-          <w:sz w:val="20"/>
-        </w:rPr>
-        <w:t>Jira Project:</w:t>
-      </w:r>
-      <w:r>
-        <w:rPr>
-          <w:i/>
-          <w:color w:val="969696"/>
-          <w:sz w:val="20"/>
-        </w:rPr>
-        <w:t xml:space="preserve"> KAN</w:t>
-      </w:r>
-    </w:p>
-    <w:p>
-      <w:pPr>
-        <w:ind w:left="567"/>
-      </w:pPr>
-      <w:r>
-        <w:rPr>
-          <w:i/>
-          <w:color w:val="969696"/>
-          <w:sz w:val="20"/>
-        </w:rPr>
-      </w:r>
-      <w:r>
-        <w:rPr>
-          <w:b/>
-          <w:i/>
-          <w:color w:val="969696"/>
-          <w:sz w:val="20"/>
-        </w:rPr>
-        <w:t>Jira URL:</w:t>
-      </w:r>
-      <w:r>
-        <w:rPr>
-          <w:i/>
-          <w:color w:val="969696"/>
-          <w:sz w:val="20"/>
-        </w:rPr>
-        <w:t xml:space="preserve"> https://alihaiderbajwa123.atlassian.net/jira/software/projects/KAN/</w:t>
-      </w:r>
-    </w:p>
-    <w:p>
-      <w:pPr>
-        <w:ind w:left="567"/>
-      </w:pPr>
-      <w:r>
-        <w:rPr>
-          <w:i/>
-          <w:color w:val="969696"/>
-          <w:sz w:val="20"/>
-        </w:rPr>
-      </w:r>
-      <w:r>
-        <w:rPr>
-          <w:b/>
-          <w:i/>
-          <w:color w:val="969696"/>
-          <w:sz w:val="20"/>
-        </w:rPr>
-        <w:t>Issues to create:</w:t>
-      </w:r>
-      <w:r>
-        <w:rPr>
-          <w:i/>
-          <w:color w:val="969696"/>
-          <w:sz w:val="20"/>
-        </w:rPr>
-      </w:r>
-    </w:p>
-    <w:p>
-      <w:pPr>
-        <w:ind w:left="567"/>
-      </w:pPr>
-      <w:r>
-        <w:rPr>
-          <w:i/>
-          <w:color w:val="969696"/>
-          <w:sz w:val="20"/>
-        </w:rPr>
-      </w:r>
-    </w:p>
-    <w:p>
-      <w:pPr>
-        <w:ind w:left="567"/>
-      </w:pPr>
-      <w:r>
-        <w:rPr>
-          <w:i/>
-          <w:color w:val="969696"/>
-          <w:sz w:val="20"/>
-        </w:rPr>
-        <w:t>| Jira Key | Title | Severity | Status | Related TC |</w:t>
-      </w:r>
-    </w:p>
-    <w:p>
-      <w:pPr>
-        <w:ind w:left="567"/>
-      </w:pPr>
-      <w:r>
-        <w:rPr>
-          <w:i/>
-          <w:color w:val="969696"/>
-          <w:sz w:val="20"/>
-        </w:rPr>
-        <w:t>|----------|-------|----------|--------|------------|</w:t>
-      </w:r>
-    </w:p>
-    <w:p>
-      <w:pPr>
-        <w:ind w:left="567"/>
-      </w:pPr>
-      <w:r>
-        <w:rPr>
-          <w:i/>
-          <w:color w:val="969696"/>
-          <w:sz w:val="20"/>
-        </w:rPr>
-        <w:t>| KAN-001 | Key file upload not supported in web interface | Major | To Do | TC-15 |</w:t>
-      </w:r>
-    </w:p>
-    <w:p>
-      <w:pPr>
-        <w:ind w:left="567"/>
-      </w:pPr>
-      <w:r>
-        <w:rPr>
-          <w:i/>
-          <w:color w:val="969696"/>
-          <w:sz w:val="20"/>
-        </w:rPr>
-        <w:t>| KAN-002 | Auto-Type sequence parsed but not executable from UI | Minor | To Do | TC-16 |</w:t>
-      </w:r>
-    </w:p>
-    <w:p>
-      <w:pPr>
-        <w:ind w:left="567"/>
-      </w:pPr>
-      <w:r>
-        <w:rPr>
-          <w:i/>
-          <w:color w:val="969696"/>
-          <w:sz w:val="20"/>
-        </w:rPr>
-        <w:t>| KAN-003 | Incorrect password error not shown in UI form | Major | To Do | TC-05 |</w:t>
-      </w:r>
-    </w:p>
-    <w:p>
-      <w:pPr>
-        <w:ind w:left="567"/>
-      </w:pPr>
-      <w:r>
-        <w:rPr>
-          <w:i/>
-          <w:color w:val="969696"/>
-          <w:sz w:val="20"/>
-        </w:rPr>
-        <w:t>| KAN-004 | Created/Updated timestamps show "Invalid Date" | Minor | To Do | TC-08, TC-10 |</w:t>
+        <w:t xml:space="preserve"> Screenshot evidence attached (KeyFile_u....png, AutoType.png, Wrong_....png, Invalid_D....png)</w:t>
       </w:r>
     </w:p>
     <w:p>
@@ -16772,7 +17146,7 @@
         <w:rPr>
           <w:sz w:val="20"/>
         </w:rPr>
-        <w:t xml:space="preserve"> Four defects were identified during manual testing. BUG-001 (Major): Key file upload not functional in web UI — browser cannot read local files via text input, blocking TC-15. BUG-002 (Minor): Auto-Type has no UI execution trigger — parsing exists but no way to invoke it, causing TC-16 to fail. BUG-003 (Major): Open database error message not displayed — server returns 401 but UI shows no feedback, causing TC-05 to fail. BUG-004 (Minor): Entry timestamps display as "Invalid Date" due to snake_case/camelCase mismatch between server and client.</w:t>
+        <w:t xml:space="preserve"> Four defects were identified during manual testing. KAN-4 (Major): Key file upload not functional in web UI — browser cannot read local files via text input, blocking TC-15. KAN-5 (Minor): Auto-Type has no UI execution trigger — parsing exists but no way to invoke it, causing TC-16 to fail. KAN-6 (Major): Open database error message not displayed — server returns 401 but UI shows no feedback, causing TC-05 to fail. KAN-7 (Minor): Entry timestamps display as "Invalid Date" due to snake_case/camelCase mismatch between server and client.</w:t>
       </w:r>
     </w:p>
     <w:p>
@@ -16812,7 +17186,7 @@
         <w:rPr>
           <w:sz w:val="20"/>
         </w:rPr>
-        <w:t xml:space="preserve"> 12 of 14 test cases pass (86%). The two Major bugs (BUG-001, BUG-003) require attention before the application can be considered release-ready. BUG-001 is justified by browser platform constraints. BUG-003 is a straightforward UI error-handling defect. BUG-002 and BUG-004 are Minor issues. The application demonstrates acceptable quality for core CRUD and password generation features, but the authentication error handling and timestamp display need remediation. The final judgment is limited to the 10 requirements evaluated.</w:t>
+        <w:t xml:space="preserve"> 12 of 14 test cases pass (86%). The two Major bugs (KAN-4, KAN-6) require attention before the application can be considered release-ready. KAN-4 is justified by browser platform constraints — web browsers cannot read local files via text input. KAN-6 is a straightforward UI error-handling defect where the server correctly rejects invalid passwords but the frontend fails to display the error message. KAN-5 and KAN-7 are Minor issues — KAN-5 reflects a platform limitation (keystroke injection is impossible in browsers), and KAN-7 is a date formatting mismatch between server and client. The application demonstrates acceptable quality for core CRUD and password generation features, but the authentication error handling needs remediation. The final judgment is limited to the 10 requirements evaluated.</w:t>
       </w:r>
     </w:p>
     <w:sectPr>

</xml_diff>